<commit_message>
Document published checkpoint verification
</commit_message>
<xml_diff>
--- a/reports/Detection_Bui_Tien_Duc_2680018.docx
+++ b/reports/Detection_Bui_Tien_Duc_2680018.docx
@@ -1435,7 +1435,35 @@
     </w:p>
     <w:p>
       <w:r>
-        <w:t>Checkpoint cần cung cấp: Detection/runs/yolo11n_pennfudan_30epochs/weights/best.pt. Checkpoint không nằm trong các ZIP minh chứng của báo cáo; cần bổ sung file hoặc URL tải để tái lập suy luận mà không train lại.</w:t>
+        <w:rPr>
+          <w:b/>
+        </w:rPr>
+        <w:t>Kiểm tra checkpoint đã công bố</w:t>
+      </w:r>
+    </w:p>
+    <w:p>
+      <w:r>
+        <w:t>Đã nạp file Detection/checkpoints/best_yolo11n_pennfudan.pt và chạy suy luận trên GPU NVIDIA GeForce RTX 3050 Ti Laptop GPU bằng Ultralytics 8.4.188, Python 3.11.0 và PyTorch 2.11.0+cu128. Ảnh test FudanPed00036.png cho 4 dự đoán person tại confidence 0,25, imgsz=416. Log ghi kích thước tensor đầu vào (1, 3, 192, 416), thời gian inference 12,3 ms và lưu ảnh tại Detection/runs/published_checkpoint_check.</w:t>
+      </w:r>
+    </w:p>
+    <w:p>
+      <w:r>
+        <w:t>Đây là phép kiểm tra khả năng nạp và suy luận từ file checkpoint trong thư mục công bố trên môi trường hiện tại; không thay thế đánh giá 26 ảnh test, không xác nhận riêng quá trình tải checkpoint từ GitHub và không được dùng như benchmark tốc độ.</w:t>
+      </w:r>
+    </w:p>
+    <w:p>
+      <w:r>
+        <w:t>Đường dẫn tải checkpoint: https://github.com/Bui-Tien-Duc/CO5085-Image-Segmentation/blob/main/Detection/checkpoints/best_yolo11n_pennfudan.pt</w:t>
+      </w:r>
+    </w:p>
+    <w:p>
+      <w:r>
+        <w:t>Ảnh minh họa cùng mẫu FudanPed00036 đã có ở Hình 4. Kết quả kiểm tra checkpoint được ghi theo log PowerShell ngày 25/10/2026.</w:t>
+      </w:r>
+    </w:p>
+    <w:p>
+      <w:r>
+        <w:t>Checkpoint đã công bố tại Detection/checkpoints/best_yolo11n_pennfudan.pt trong repository. Bản gốc sau huấn luyện nằm tại Detection/runs/yolo11n_pennfudan_30epochs/weights/best.pt. Không cần huấn luyện lại để thực hiện suy luận.</w:t>
       </w:r>
     </w:p>
     <w:p>

</xml_diff>